<commit_message>
Finally at the final stretch.
Virtually everything is done, I just need to refine the modal details a bit, see if I can't make the index page a bit more sane, make the official documents actually official, and the 21+ warning.
</commit_message>
<xml_diff>
--- a/files/Rulesdiff.docx
+++ b/files/Rulesdiff.docx
@@ -7,7 +7,23 @@
         <w:spacing w:after="0" w:line="240" w:lineRule="auto"/>
       </w:pPr>
       <w:r>
-        <w:t>FLAG contest rules differences between document and website.</w:t>
+        <w:t xml:space="preserve">FLAG contest rules differences between </w:t>
+      </w:r>
+      <w:proofErr w:type="gramStart"/>
+      <w:r>
+        <w:t>document</w:t>
+      </w:r>
+      <w:proofErr w:type="gramEnd"/>
+      <w:r>
+        <w:t xml:space="preserve"> and </w:t>
+      </w:r>
+      <w:proofErr w:type="gramStart"/>
+      <w:r>
+        <w:t>website</w:t>
+      </w:r>
+      <w:proofErr w:type="gramEnd"/>
+      <w:r>
+        <w:t>.</w:t>
       </w:r>
     </w:p>
     <w:p>
@@ -109,7 +125,79 @@
           <w:bCs/>
           <w:u w:val="single"/>
         </w:rPr>
-        <w:t>Anybody who is already a current titleholder for a different contest / organization cannot compete for Mr/Ms/Mx/Q FLAG. The winner of Mr/Ms/Mx/Q FLAG is permitted to compete at any other local leather contest after their title year. If the current title holder would like to compete for a national or international title during their title year it must be approved by the FLAG board.</w:t>
+        <w:t xml:space="preserve">Anybody who is already a current titleholder for a different contest / organization cannot compete for </w:t>
+      </w:r>
+      <w:proofErr w:type="spellStart"/>
+      <w:r>
+        <w:rPr>
+          <w:b/>
+          <w:bCs/>
+          <w:u w:val="single"/>
+        </w:rPr>
+        <w:t>Mr</w:t>
+      </w:r>
+      <w:proofErr w:type="spellEnd"/>
+      <w:r>
+        <w:rPr>
+          <w:b/>
+          <w:bCs/>
+          <w:u w:val="single"/>
+        </w:rPr>
+        <w:t>/</w:t>
+      </w:r>
+      <w:proofErr w:type="spellStart"/>
+      <w:r>
+        <w:rPr>
+          <w:b/>
+          <w:bCs/>
+          <w:u w:val="single"/>
+        </w:rPr>
+        <w:t>Ms</w:t>
+      </w:r>
+      <w:proofErr w:type="spellEnd"/>
+      <w:r>
+        <w:rPr>
+          <w:b/>
+          <w:bCs/>
+          <w:u w:val="single"/>
+        </w:rPr>
+        <w:t xml:space="preserve">/Mx/Q FLAG. The winner of </w:t>
+      </w:r>
+      <w:proofErr w:type="spellStart"/>
+      <w:r>
+        <w:rPr>
+          <w:b/>
+          <w:bCs/>
+          <w:u w:val="single"/>
+        </w:rPr>
+        <w:t>Mr</w:t>
+      </w:r>
+      <w:proofErr w:type="spellEnd"/>
+      <w:r>
+        <w:rPr>
+          <w:b/>
+          <w:bCs/>
+          <w:u w:val="single"/>
+        </w:rPr>
+        <w:t>/</w:t>
+      </w:r>
+      <w:proofErr w:type="spellStart"/>
+      <w:r>
+        <w:rPr>
+          <w:b/>
+          <w:bCs/>
+          <w:u w:val="single"/>
+        </w:rPr>
+        <w:t>Ms</w:t>
+      </w:r>
+      <w:proofErr w:type="spellEnd"/>
+      <w:r>
+        <w:rPr>
+          <w:b/>
+          <w:bCs/>
+          <w:u w:val="single"/>
+        </w:rPr>
+        <w:t>/Mx/Q FLAG is permitted to compete at any other local leather contest after their title year. If the current title holder would like to compete for a national or international title during their title year it must be approved by the FLAG board.</w:t>
       </w:r>
       <w:r>
         <w:br/>
@@ -124,7 +212,79 @@
           <w:bCs/>
           <w:u w:val="single"/>
         </w:rPr>
-        <w:t>Anybody who is already a current titleholder for a different contest / organization cannot compete for Mr/Ms/Mx/Q FLAG. The winner of Mr/Ms/Mx/Q FLAG is permitted to compete at any other local leather contest after their title year. If the current title holder would like to compete for a national or international title during their title year it must be approved by the FLAG board.</w:t>
+        <w:t xml:space="preserve">Anybody who is already a current titleholder for a different contest / organization cannot compete for </w:t>
+      </w:r>
+      <w:proofErr w:type="spellStart"/>
+      <w:r>
+        <w:rPr>
+          <w:b/>
+          <w:bCs/>
+          <w:u w:val="single"/>
+        </w:rPr>
+        <w:t>Mr</w:t>
+      </w:r>
+      <w:proofErr w:type="spellEnd"/>
+      <w:r>
+        <w:rPr>
+          <w:b/>
+          <w:bCs/>
+          <w:u w:val="single"/>
+        </w:rPr>
+        <w:t>/</w:t>
+      </w:r>
+      <w:proofErr w:type="spellStart"/>
+      <w:r>
+        <w:rPr>
+          <w:b/>
+          <w:bCs/>
+          <w:u w:val="single"/>
+        </w:rPr>
+        <w:t>Ms</w:t>
+      </w:r>
+      <w:proofErr w:type="spellEnd"/>
+      <w:r>
+        <w:rPr>
+          <w:b/>
+          <w:bCs/>
+          <w:u w:val="single"/>
+        </w:rPr>
+        <w:t xml:space="preserve">/Mx/Q FLAG. The winner of </w:t>
+      </w:r>
+      <w:proofErr w:type="spellStart"/>
+      <w:r>
+        <w:rPr>
+          <w:b/>
+          <w:bCs/>
+          <w:u w:val="single"/>
+        </w:rPr>
+        <w:t>Mr</w:t>
+      </w:r>
+      <w:proofErr w:type="spellEnd"/>
+      <w:r>
+        <w:rPr>
+          <w:b/>
+          <w:bCs/>
+          <w:u w:val="single"/>
+        </w:rPr>
+        <w:t>/</w:t>
+      </w:r>
+      <w:proofErr w:type="spellStart"/>
+      <w:r>
+        <w:rPr>
+          <w:b/>
+          <w:bCs/>
+          <w:u w:val="single"/>
+        </w:rPr>
+        <w:t>Ms</w:t>
+      </w:r>
+      <w:proofErr w:type="spellEnd"/>
+      <w:r>
+        <w:rPr>
+          <w:b/>
+          <w:bCs/>
+          <w:u w:val="single"/>
+        </w:rPr>
+        <w:t>/Mx/Q FLAG is permitted to compete at any other local leather contest after their title year. If the current title holder would like to compete for a national or international title during their title year it must be approved by the FLAG board.</w:t>
       </w:r>
     </w:p>
     <w:p>
@@ -238,7 +398,15 @@
         <w:t>Old Rule 6 moved to Rule 7</w:t>
       </w:r>
       <w:r>
-        <w:t>.  Phrasing is exactly the same, removed parentheses.</w:t>
+        <w:t xml:space="preserve">.  Phrasing is </w:t>
+      </w:r>
+      <w:proofErr w:type="gramStart"/>
+      <w:r>
+        <w:t>exactly the same</w:t>
+      </w:r>
+      <w:proofErr w:type="gramEnd"/>
+      <w:r>
+        <w:t>, removed parentheses.</w:t>
       </w:r>
     </w:p>
     <w:p>
@@ -264,25 +432,25 @@
           <w:bCs/>
           <w:u w:val="single"/>
         </w:rPr>
+        <w:t>By signing the application, contestants will allow their before- and after-contest and on-stage photographs to be taken and printed in FLAG’s social media, FLAG web site, or any FLAG-related publications, digital or printed.</w:t>
+      </w:r>
+      <w:r>
+        <w:t xml:space="preserve"> </w:t>
+      </w:r>
+      <w:r>
+        <w:br/>
+        <w:t>-&gt;</w:t>
+      </w:r>
+      <w:r>
+        <w:br/>
+      </w:r>
+      <w:r>
+        <w:rPr>
+          <w:b/>
+          <w:bCs/>
+          <w:u w:val="single"/>
+        </w:rPr>
         <w:lastRenderedPageBreak/>
-        <w:t>By signing the application, contestants will allow their before- and after-contest and on-stage photographs to be taken and printed in FLAG’s social media, FLAG web site, or any FLAG-related publications, digital or printed.</w:t>
-      </w:r>
-      <w:r>
-        <w:t xml:space="preserve"> </w:t>
-      </w:r>
-      <w:r>
-        <w:br/>
-        <w:t>-&gt;</w:t>
-      </w:r>
-      <w:r>
-        <w:br/>
-      </w:r>
-      <w:r>
-        <w:rPr>
-          <w:b/>
-          <w:bCs/>
-          <w:u w:val="single"/>
-        </w:rPr>
         <w:t>By competing, contestants agree that contest photographs will be taken, whether before, during or after the on-stage performance.</w:t>
       </w:r>
     </w:p>
@@ -306,7 +474,25 @@
           <w:bCs/>
           <w:u w:val="single"/>
         </w:rPr>
-        <w:t>All photographs become the property of Fits Like A Glove.</w:t>
+        <w:t xml:space="preserve">All photographs become the property of Fits Like </w:t>
+      </w:r>
+      <w:proofErr w:type="gramStart"/>
+      <w:r>
+        <w:rPr>
+          <w:b/>
+          <w:bCs/>
+          <w:u w:val="single"/>
+        </w:rPr>
+        <w:t>A</w:t>
+      </w:r>
+      <w:proofErr w:type="gramEnd"/>
+      <w:r>
+        <w:rPr>
+          <w:b/>
+          <w:bCs/>
+          <w:u w:val="single"/>
+        </w:rPr>
+        <w:t xml:space="preserve"> Glove.</w:t>
       </w:r>
       <w:r>
         <w:rPr>
@@ -397,6 +583,46 @@
       <w:r>
         <w:t xml:space="preserve"> because I hate the word shall.</w:t>
       </w:r>
+      <w:r>
+        <w:t xml:space="preserve">   For reference:</w:t>
+      </w:r>
+    </w:p>
+    <w:p>
+      <w:pPr>
+        <w:pStyle w:val="ListParagraph"/>
+        <w:ind w:left="1080"/>
+        <w:rPr>
+          <w:b/>
+          <w:bCs/>
+          <w:u w:val="single"/>
+        </w:rPr>
+      </w:pPr>
+      <w:r>
+        <w:rPr>
+          <w:b/>
+          <w:bCs/>
+          <w:u w:val="single"/>
+        </w:rPr>
+        <w:t xml:space="preserve">The winner will receive a FLAG back patch, become a lifetime member to Fits Like </w:t>
+      </w:r>
+      <w:proofErr w:type="gramStart"/>
+      <w:r>
+        <w:rPr>
+          <w:b/>
+          <w:bCs/>
+          <w:u w:val="single"/>
+        </w:rPr>
+        <w:t>A</w:t>
+      </w:r>
+      <w:proofErr w:type="gramEnd"/>
+      <w:r>
+        <w:rPr>
+          <w:b/>
+          <w:bCs/>
+          <w:u w:val="single"/>
+        </w:rPr>
+        <w:t xml:space="preserve"> Glove, a pair of gloves, a FLAG T-shirt, and $100 cash.</w:t>
+      </w:r>
     </w:p>
     <w:p>
       <w:pPr>
@@ -405,17 +631,799 @@
           <w:ilvl w:val="0"/>
           <w:numId w:val="4"/>
         </w:numPr>
-      </w:pPr>
-      <w:r>
-        <w:br/>
-      </w:r>
-      <w:r>
-        <w:br/>
+        <w:rPr>
+          <w:b/>
+          <w:bCs/>
+          <w:u w:val="single"/>
+        </w:rPr>
+      </w:pPr>
+      <w:r>
+        <w:t>Old Rule 10 moved the second rule in this new category.  Phrasing changed somewhat but the core is kept intact:</w:t>
+      </w:r>
+      <w:r>
+        <w:br/>
+      </w:r>
+      <w:r>
+        <w:rPr>
+          <w:b/>
+          <w:bCs/>
+          <w:u w:val="single"/>
+        </w:rPr>
+        <w:t xml:space="preserve">The winner will also receive the </w:t>
+      </w:r>
+      <w:proofErr w:type="spellStart"/>
+      <w:r>
+        <w:rPr>
+          <w:b/>
+          <w:bCs/>
+          <w:u w:val="single"/>
+        </w:rPr>
+        <w:t>Mr</w:t>
+      </w:r>
+      <w:proofErr w:type="spellEnd"/>
+      <w:r>
+        <w:rPr>
+          <w:b/>
+          <w:bCs/>
+          <w:u w:val="single"/>
+        </w:rPr>
+        <w:t>/</w:t>
+      </w:r>
+      <w:proofErr w:type="spellStart"/>
+      <w:r>
+        <w:rPr>
+          <w:b/>
+          <w:bCs/>
+          <w:u w:val="single"/>
+        </w:rPr>
+        <w:t>Ms</w:t>
+      </w:r>
+      <w:proofErr w:type="spellEnd"/>
+      <w:r>
+        <w:rPr>
+          <w:b/>
+          <w:bCs/>
+          <w:u w:val="single"/>
+        </w:rPr>
+        <w:t xml:space="preserve">/Mx/Q FLAG sash to use for their title year. This sash is not theirs to keep, it must be returned for their step down and to present to the following year’s winner. This sash will be a legacy sash used for each title year and is expected to be kept in great condition by each titleholder. Any damage or loss of the </w:t>
+      </w:r>
+      <w:proofErr w:type="gramStart"/>
+      <w:r>
+        <w:rPr>
+          <w:b/>
+          <w:bCs/>
+          <w:u w:val="single"/>
+        </w:rPr>
+        <w:t>sash and it</w:t>
+      </w:r>
+      <w:proofErr w:type="gramEnd"/>
+      <w:r>
+        <w:rPr>
+          <w:b/>
+          <w:bCs/>
+          <w:u w:val="single"/>
+        </w:rPr>
+        <w:t xml:space="preserve"> will be the </w:t>
+      </w:r>
+      <w:proofErr w:type="gramStart"/>
+      <w:r>
+        <w:rPr>
+          <w:b/>
+          <w:bCs/>
+          <w:u w:val="single"/>
+        </w:rPr>
+        <w:t>titleholder’s</w:t>
+      </w:r>
+      <w:proofErr w:type="gramEnd"/>
+      <w:r>
+        <w:rPr>
+          <w:b/>
+          <w:bCs/>
+          <w:u w:val="single"/>
+        </w:rPr>
+        <w:t xml:space="preserve"> responsibility to replace it.</w:t>
+      </w:r>
+      <w:r>
+        <w:t xml:space="preserve"> </w:t>
+      </w:r>
+      <w:r>
+        <w:br/>
+        <w:t>-&gt;</w:t>
+      </w:r>
+      <w:r>
+        <w:br/>
+      </w:r>
+      <w:r>
+        <w:rPr>
+          <w:b/>
+          <w:bCs/>
+          <w:u w:val="single"/>
+        </w:rPr>
+        <w:t xml:space="preserve">The winner will also receive the </w:t>
+      </w:r>
+      <w:proofErr w:type="spellStart"/>
+      <w:r>
+        <w:rPr>
+          <w:b/>
+          <w:bCs/>
+          <w:u w:val="single"/>
+        </w:rPr>
+        <w:t>Mr</w:t>
+      </w:r>
+      <w:proofErr w:type="spellEnd"/>
+      <w:r>
+        <w:rPr>
+          <w:b/>
+          <w:bCs/>
+          <w:u w:val="single"/>
+        </w:rPr>
+        <w:t>/</w:t>
+      </w:r>
+      <w:proofErr w:type="spellStart"/>
+      <w:r>
+        <w:rPr>
+          <w:b/>
+          <w:bCs/>
+          <w:u w:val="single"/>
+        </w:rPr>
+        <w:t>Ms</w:t>
+      </w:r>
+      <w:proofErr w:type="spellEnd"/>
+      <w:r>
+        <w:rPr>
+          <w:b/>
+          <w:bCs/>
+          <w:u w:val="single"/>
+        </w:rPr>
+        <w:t xml:space="preserve">/Mx/Q FLAG sash to use for their title year. </w:t>
+      </w:r>
+      <w:r>
+        <w:rPr>
+          <w:b/>
+          <w:bCs/>
+          <w:u w:val="single"/>
+        </w:rPr>
+        <w:br/>
+      </w:r>
+      <w:r>
+        <w:rPr>
+          <w:b/>
+          <w:bCs/>
+          <w:i/>
+          <w:iCs/>
+          <w:u w:val="single"/>
+        </w:rPr>
+        <w:t xml:space="preserve">(Please note: The sash is not the </w:t>
+      </w:r>
+      <w:proofErr w:type="gramStart"/>
+      <w:r>
+        <w:rPr>
+          <w:b/>
+          <w:bCs/>
+          <w:i/>
+          <w:iCs/>
+          <w:u w:val="single"/>
+        </w:rPr>
+        <w:t>winner's</w:t>
+      </w:r>
+      <w:proofErr w:type="gramEnd"/>
+      <w:r>
+        <w:rPr>
+          <w:b/>
+          <w:bCs/>
+          <w:i/>
+          <w:iCs/>
+          <w:u w:val="single"/>
+        </w:rPr>
+        <w:t xml:space="preserve"> to keep after their title year. It must be returned when they step </w:t>
+      </w:r>
+      <w:proofErr w:type="gramStart"/>
+      <w:r>
+        <w:rPr>
+          <w:b/>
+          <w:bCs/>
+          <w:i/>
+          <w:iCs/>
+          <w:u w:val="single"/>
+        </w:rPr>
+        <w:t>down, and</w:t>
+      </w:r>
+      <w:proofErr w:type="gramEnd"/>
+      <w:r>
+        <w:rPr>
+          <w:b/>
+          <w:bCs/>
+          <w:i/>
+          <w:iCs/>
+          <w:u w:val="single"/>
+        </w:rPr>
+        <w:t xml:space="preserve"> is to be presented to the following year’s winner. The sash is expected to be kept in great condition by each titleholder. It is the titleholder's responsibility to replace it if it is lost or damaged.)</w:t>
+      </w:r>
+    </w:p>
+    <w:p>
+      <w:pPr>
+        <w:pStyle w:val="ListParagraph"/>
+        <w:numPr>
+          <w:ilvl w:val="0"/>
+          <w:numId w:val="4"/>
+        </w:numPr>
+      </w:pPr>
+      <w:r>
+        <w:t xml:space="preserve">Old Rule 11 </w:t>
+      </w:r>
+      <w:proofErr w:type="gramStart"/>
+      <w:r>
+        <w:t>is</w:t>
+      </w:r>
+      <w:proofErr w:type="gramEnd"/>
+      <w:r>
+        <w:t xml:space="preserve"> moved to the third rule in this new category.  Phrasing is changed (Mostly to be consistent, the rules document specified a year rather than being broad):</w:t>
+      </w:r>
+      <w:r>
+        <w:br/>
+      </w:r>
+      <w:r>
+        <w:rPr>
+          <w:b/>
+          <w:bCs/>
+          <w:u w:val="single"/>
+        </w:rPr>
+        <w:t>As a representative of FLAG, the contest winner will be expected to participate in all FLAG-related events from August 2026 - August 31, 2027. The titleholder is expected to be present and march in the Boston Pride and required to march in Providence Pride Parade, be a judge, and step down at the next contest. The winner is also expected to have one fund raising event to help raise money for the charity of their choice and FLAG. The charity must be approved by the FLAG board.</w:t>
+      </w:r>
+      <w:r>
+        <w:t xml:space="preserve"> </w:t>
+      </w:r>
+      <w:r>
+        <w:br/>
+        <w:t>-&gt;</w:t>
+      </w:r>
+      <w:r>
+        <w:br/>
+      </w:r>
+      <w:r>
+        <w:rPr>
+          <w:b/>
+          <w:bCs/>
+          <w:u w:val="single"/>
+        </w:rPr>
+        <w:t xml:space="preserve">As a representative of FLAG, the contest winner is expected to participate in all FLAG-related events from </w:t>
+      </w:r>
+      <w:proofErr w:type="spellStart"/>
+      <w:r>
+        <w:rPr>
+          <w:b/>
+          <w:bCs/>
+          <w:u w:val="single"/>
+        </w:rPr>
+        <w:t>from</w:t>
+      </w:r>
+      <w:proofErr w:type="spellEnd"/>
+      <w:r>
+        <w:rPr>
+          <w:b/>
+          <w:bCs/>
+          <w:u w:val="single"/>
+        </w:rPr>
+        <w:t xml:space="preserve"> the start of their title year through the end of the next contest. </w:t>
+      </w:r>
+      <w:r>
+        <w:rPr>
+          <w:b/>
+          <w:bCs/>
+          <w:u w:val="single"/>
+        </w:rPr>
+        <w:lastRenderedPageBreak/>
+        <w:t xml:space="preserve">Titleholders are expected to be present and march in </w:t>
+      </w:r>
+      <w:hyperlink r:id="rId5" w:tgtFrame="_blank" w:history="1">
+        <w:r>
+          <w:rPr>
+            <w:rStyle w:val="Hyperlink"/>
+            <w:b/>
+            <w:bCs/>
+          </w:rPr>
+          <w:t>Boston Pride</w:t>
+        </w:r>
+      </w:hyperlink>
+      <w:r>
+        <w:rPr>
+          <w:b/>
+          <w:bCs/>
+          <w:u w:val="single"/>
+        </w:rPr>
+        <w:t xml:space="preserve">, and </w:t>
+      </w:r>
+      <w:r>
+        <w:rPr>
+          <w:b/>
+          <w:bCs/>
+          <w:i/>
+          <w:iCs/>
+          <w:u w:val="single"/>
+        </w:rPr>
+        <w:t>required</w:t>
+      </w:r>
+      <w:r>
+        <w:rPr>
+          <w:b/>
+          <w:bCs/>
+          <w:u w:val="single"/>
+        </w:rPr>
+        <w:t xml:space="preserve"> to march in </w:t>
+      </w:r>
+      <w:hyperlink r:id="rId6" w:tgtFrame="_blank" w:history="1">
+        <w:r>
+          <w:rPr>
+            <w:rStyle w:val="Hyperlink"/>
+            <w:b/>
+            <w:bCs/>
+          </w:rPr>
+          <w:t>Providence Pride Parade</w:t>
+        </w:r>
+      </w:hyperlink>
+      <w:r>
+        <w:rPr>
+          <w:b/>
+          <w:bCs/>
+          <w:u w:val="single"/>
+        </w:rPr>
+        <w:t>. Titleholders are expected to be a judge for, and step down at, the next FLAG contest. During their title years, Titleholders are expected to do one fund raising event to help raise money for a charity of their choice, as well as one fundraising event for FLAG. The charity must be approved by the FLAG board.</w:t>
+      </w:r>
+    </w:p>
+    <w:p>
+      <w:pPr>
+        <w:pStyle w:val="ListParagraph"/>
+        <w:numPr>
+          <w:ilvl w:val="0"/>
+          <w:numId w:val="4"/>
+        </w:numPr>
+      </w:pPr>
+      <w:r>
+        <w:t>Old rules 12 and 13 are now merged into one new rule, the fourth in this category.  This is because they’re so closely related and flow into each other that they can best be expressed together.</w:t>
+      </w:r>
+      <w:r>
+        <w:br/>
+        <w:t xml:space="preserve">Old Rule 12: </w:t>
+      </w:r>
+      <w:r>
+        <w:rPr>
+          <w:b/>
+          <w:bCs/>
+          <w:u w:val="single"/>
+        </w:rPr>
+        <w:t xml:space="preserve">Anybody who is already a current titleholder for a different contest / organization cannot compete for </w:t>
+      </w:r>
+      <w:proofErr w:type="spellStart"/>
+      <w:r>
+        <w:rPr>
+          <w:b/>
+          <w:bCs/>
+          <w:u w:val="single"/>
+        </w:rPr>
+        <w:t>Mr</w:t>
+      </w:r>
+      <w:proofErr w:type="spellEnd"/>
+      <w:r>
+        <w:rPr>
+          <w:b/>
+          <w:bCs/>
+          <w:u w:val="single"/>
+        </w:rPr>
+        <w:t>/</w:t>
+      </w:r>
+      <w:proofErr w:type="spellStart"/>
+      <w:r>
+        <w:rPr>
+          <w:b/>
+          <w:bCs/>
+          <w:u w:val="single"/>
+        </w:rPr>
+        <w:t>Ms</w:t>
+      </w:r>
+      <w:proofErr w:type="spellEnd"/>
+      <w:r>
+        <w:rPr>
+          <w:b/>
+          <w:bCs/>
+          <w:u w:val="single"/>
+        </w:rPr>
+        <w:t xml:space="preserve">/Mx/Q FLAG. The winner of </w:t>
+      </w:r>
+      <w:proofErr w:type="spellStart"/>
+      <w:r>
+        <w:rPr>
+          <w:b/>
+          <w:bCs/>
+          <w:u w:val="single"/>
+        </w:rPr>
+        <w:t>Mr</w:t>
+      </w:r>
+      <w:proofErr w:type="spellEnd"/>
+      <w:r>
+        <w:rPr>
+          <w:b/>
+          <w:bCs/>
+          <w:u w:val="single"/>
+        </w:rPr>
+        <w:t>/</w:t>
+      </w:r>
+      <w:proofErr w:type="spellStart"/>
+      <w:r>
+        <w:rPr>
+          <w:b/>
+          <w:bCs/>
+          <w:u w:val="single"/>
+        </w:rPr>
+        <w:t>Ms</w:t>
+      </w:r>
+      <w:proofErr w:type="spellEnd"/>
+      <w:r>
+        <w:rPr>
+          <w:b/>
+          <w:bCs/>
+          <w:u w:val="single"/>
+        </w:rPr>
+        <w:t xml:space="preserve">/Mx/Q FLAG is permitted to compete at any other local leather contest after their title year. If the current title holder would like to compete </w:t>
+      </w:r>
+      <w:proofErr w:type="gramStart"/>
+      <w:r>
+        <w:rPr>
+          <w:b/>
+          <w:bCs/>
+          <w:u w:val="single"/>
+        </w:rPr>
+        <w:t>for  a</w:t>
+      </w:r>
+      <w:proofErr w:type="gramEnd"/>
+      <w:r>
+        <w:rPr>
+          <w:b/>
+          <w:bCs/>
+          <w:u w:val="single"/>
+        </w:rPr>
+        <w:t xml:space="preserve"> national or international title during their title year it must be approved by the FLAG board. </w:t>
+      </w:r>
+      <w:r>
+        <w:br/>
+        <w:t xml:space="preserve">Old Rule 13: </w:t>
+      </w:r>
+      <w:r>
+        <w:rPr>
+          <w:b/>
+          <w:bCs/>
+          <w:u w:val="single"/>
+        </w:rPr>
+        <w:t xml:space="preserve">If you so </w:t>
+      </w:r>
+      <w:proofErr w:type="spellStart"/>
+      <w:r>
+        <w:rPr>
+          <w:b/>
+          <w:bCs/>
+          <w:u w:val="single"/>
+        </w:rPr>
+        <w:t>chose</w:t>
+      </w:r>
+      <w:proofErr w:type="spellEnd"/>
+      <w:r>
+        <w:rPr>
+          <w:b/>
+          <w:bCs/>
+          <w:u w:val="single"/>
+        </w:rPr>
+        <w:t xml:space="preserve"> to enter another contest such as IML, MAL, </w:t>
+      </w:r>
+      <w:proofErr w:type="spellStart"/>
+      <w:proofErr w:type="gramStart"/>
+      <w:r>
+        <w:rPr>
+          <w:b/>
+          <w:bCs/>
+          <w:u w:val="single"/>
+        </w:rPr>
+        <w:t>IMsL</w:t>
+      </w:r>
+      <w:proofErr w:type="spellEnd"/>
+      <w:r>
+        <w:rPr>
+          <w:b/>
+          <w:bCs/>
+          <w:u w:val="single"/>
+        </w:rPr>
+        <w:t>,  FLAG</w:t>
+      </w:r>
+      <w:proofErr w:type="gramEnd"/>
+      <w:r>
+        <w:rPr>
+          <w:b/>
+          <w:bCs/>
+          <w:u w:val="single"/>
+        </w:rPr>
+        <w:t xml:space="preserve"> </w:t>
+      </w:r>
+      <w:proofErr w:type="gramStart"/>
+      <w:r>
+        <w:rPr>
+          <w:b/>
+          <w:bCs/>
+          <w:u w:val="single"/>
+        </w:rPr>
+        <w:t>will</w:t>
+      </w:r>
+      <w:proofErr w:type="gramEnd"/>
+      <w:r>
+        <w:rPr>
+          <w:b/>
+          <w:bCs/>
+          <w:u w:val="single"/>
+        </w:rPr>
+        <w:t xml:space="preserve"> do what we can to support you, but we cannot afford Airfare or Hotel. FLAG may be willing to sponsor you and pay sponsor fees, if any, and if the funds are available.</w:t>
+      </w:r>
+      <w:r>
+        <w:t xml:space="preserve"> </w:t>
+      </w:r>
+      <w:r>
+        <w:br/>
+        <w:t>-&gt;</w:t>
+      </w:r>
+      <w:r>
+        <w:br/>
+      </w:r>
+      <w:r>
+        <w:rPr>
+          <w:b/>
+          <w:bCs/>
+          <w:u w:val="single"/>
+        </w:rPr>
+        <w:t xml:space="preserve">The winner of the FLAG contest is not permitted to compete at another local leather contest until after their title year expires. However, the current title holder may - with FLAG board approval - compete for a regional, national or international title during their title year. If approved </w:t>
+      </w:r>
+      <w:proofErr w:type="gramStart"/>
+      <w:r>
+        <w:rPr>
+          <w:b/>
+          <w:bCs/>
+          <w:u w:val="single"/>
+        </w:rPr>
+        <w:t>for</w:t>
+      </w:r>
+      <w:proofErr w:type="gramEnd"/>
+      <w:r>
+        <w:rPr>
+          <w:b/>
+          <w:bCs/>
+          <w:u w:val="single"/>
+        </w:rPr>
+        <w:t xml:space="preserve"> a regional, national or international competition, FLAG will do what we can to support you. FLAG may be willing to sponsor you and pay sponsor fees, if any, and if the funds are available, though we </w:t>
+      </w:r>
+      <w:proofErr w:type="spellStart"/>
+      <w:proofErr w:type="gramStart"/>
+      <w:r>
+        <w:rPr>
+          <w:b/>
+          <w:bCs/>
+          <w:u w:val="single"/>
+        </w:rPr>
+        <w:t>can not</w:t>
+      </w:r>
+      <w:proofErr w:type="spellEnd"/>
+      <w:proofErr w:type="gramEnd"/>
+      <w:r>
+        <w:rPr>
+          <w:b/>
+          <w:bCs/>
+          <w:u w:val="single"/>
+        </w:rPr>
+        <w:t xml:space="preserve"> cover hotel or travel expenses)</w:t>
+      </w:r>
+    </w:p>
+    <w:p>
+      <w:pPr>
+        <w:pStyle w:val="ListParagraph"/>
+        <w:numPr>
+          <w:ilvl w:val="0"/>
+          <w:numId w:val="4"/>
+        </w:numPr>
+      </w:pPr>
+      <w:r>
+        <w:t>Old Rule 14 is now rule 5 in this new category.  Rule 14’s phrasing is streamlined but the point is kept intact.</w:t>
+      </w:r>
+      <w:r>
+        <w:br/>
+      </w:r>
+      <w:r>
+        <w:rPr>
+          <w:b/>
+          <w:bCs/>
+          <w:u w:val="single"/>
+        </w:rPr>
+        <w:t xml:space="preserve">Fits Like </w:t>
+      </w:r>
+      <w:proofErr w:type="gramStart"/>
+      <w:r>
+        <w:rPr>
+          <w:b/>
+          <w:bCs/>
+          <w:u w:val="single"/>
+        </w:rPr>
+        <w:t>A</w:t>
+      </w:r>
+      <w:proofErr w:type="gramEnd"/>
+      <w:r>
+        <w:rPr>
+          <w:b/>
+          <w:bCs/>
+          <w:u w:val="single"/>
+        </w:rPr>
+        <w:t xml:space="preserve"> Glove requests that the winner of the </w:t>
+      </w:r>
+      <w:proofErr w:type="spellStart"/>
+      <w:r>
+        <w:rPr>
+          <w:b/>
+          <w:bCs/>
+          <w:u w:val="single"/>
+        </w:rPr>
+        <w:t>Mr</w:t>
+      </w:r>
+      <w:proofErr w:type="spellEnd"/>
+      <w:r>
+        <w:rPr>
+          <w:b/>
+          <w:bCs/>
+          <w:u w:val="single"/>
+        </w:rPr>
+        <w:t>/</w:t>
+      </w:r>
+      <w:proofErr w:type="spellStart"/>
+      <w:r>
+        <w:rPr>
+          <w:b/>
+          <w:bCs/>
+          <w:u w:val="single"/>
+        </w:rPr>
+        <w:t>Ms</w:t>
+      </w:r>
+      <w:proofErr w:type="spellEnd"/>
+      <w:r>
+        <w:rPr>
+          <w:b/>
+          <w:bCs/>
+          <w:u w:val="single"/>
+        </w:rPr>
+        <w:t xml:space="preserve">/Mx/Q FLAG contest conduct themselves in an appropriate and respectful manner when wearing the back patch and/or Sash and representing the FLAG title. FLAG is a social based organization and as such the title holder must represent FLAG as such. If the title holder wants to participate in any political rallies and </w:t>
+      </w:r>
+      <w:proofErr w:type="gramStart"/>
+      <w:r>
+        <w:rPr>
+          <w:b/>
+          <w:bCs/>
+          <w:u w:val="single"/>
+        </w:rPr>
+        <w:t>events</w:t>
+      </w:r>
+      <w:proofErr w:type="gramEnd"/>
+      <w:r>
+        <w:rPr>
+          <w:b/>
+          <w:bCs/>
+          <w:u w:val="single"/>
+        </w:rPr>
+        <w:t xml:space="preserve"> they must do </w:t>
+      </w:r>
+      <w:proofErr w:type="gramStart"/>
+      <w:r>
+        <w:rPr>
+          <w:b/>
+          <w:bCs/>
+          <w:u w:val="single"/>
+        </w:rPr>
+        <w:t>it as</w:t>
+      </w:r>
+      <w:proofErr w:type="gramEnd"/>
+      <w:r>
+        <w:rPr>
+          <w:b/>
+          <w:bCs/>
+          <w:u w:val="single"/>
+        </w:rPr>
+        <w:t xml:space="preserve"> themselves and not as a representative of FLAG and </w:t>
+      </w:r>
+      <w:proofErr w:type="spellStart"/>
+      <w:proofErr w:type="gramStart"/>
+      <w:r>
+        <w:rPr>
+          <w:b/>
+          <w:bCs/>
+          <w:u w:val="single"/>
+        </w:rPr>
+        <w:t>it’s</w:t>
+      </w:r>
+      <w:proofErr w:type="spellEnd"/>
+      <w:proofErr w:type="gramEnd"/>
+      <w:r>
+        <w:rPr>
+          <w:b/>
+          <w:bCs/>
+          <w:u w:val="single"/>
+        </w:rPr>
+        <w:t xml:space="preserve"> members. This is to include any postings on social media and any interviews, media coverage, whether it be digital or print.</w:t>
+      </w:r>
+      <w:r>
+        <w:t xml:space="preserve"> </w:t>
+      </w:r>
+      <w:r>
+        <w:br/>
+        <w:t>-&gt;</w:t>
+      </w:r>
+      <w:r>
+        <w:br/>
+      </w:r>
+      <w:r>
+        <w:rPr>
+          <w:b/>
+          <w:bCs/>
+          <w:u w:val="single"/>
+        </w:rPr>
+        <w:t xml:space="preserve">FLAG requests that the winner of the FLAG Contest conduct themselves in an appropriate and respectful manner when wearing the back patch and/or </w:t>
+      </w:r>
+      <w:proofErr w:type="gramStart"/>
+      <w:r>
+        <w:rPr>
+          <w:b/>
+          <w:bCs/>
+          <w:u w:val="single"/>
+        </w:rPr>
+        <w:t>sash, and</w:t>
+      </w:r>
+      <w:proofErr w:type="gramEnd"/>
+      <w:r>
+        <w:rPr>
+          <w:b/>
+          <w:bCs/>
+          <w:u w:val="single"/>
+        </w:rPr>
+        <w:t xml:space="preserve"> representing the FLAG title. FLAG is a community-based </w:t>
+      </w:r>
+      <w:proofErr w:type="gramStart"/>
+      <w:r>
+        <w:rPr>
+          <w:b/>
+          <w:bCs/>
+          <w:u w:val="single"/>
+        </w:rPr>
+        <w:t>organization</w:t>
+      </w:r>
+      <w:proofErr w:type="gramEnd"/>
+      <w:r>
+        <w:rPr>
+          <w:b/>
+          <w:bCs/>
+          <w:u w:val="single"/>
+        </w:rPr>
+        <w:t xml:space="preserve"> and the title holder must represent FLAG as such. If the title holder wants to participate in any political rallies and events, they must do </w:t>
+      </w:r>
+      <w:proofErr w:type="gramStart"/>
+      <w:r>
+        <w:rPr>
+          <w:b/>
+          <w:bCs/>
+          <w:u w:val="single"/>
+        </w:rPr>
+        <w:t>it as</w:t>
+      </w:r>
+      <w:proofErr w:type="gramEnd"/>
+      <w:r>
+        <w:rPr>
+          <w:b/>
+          <w:bCs/>
+          <w:u w:val="single"/>
+        </w:rPr>
+        <w:t xml:space="preserve"> themselves and not as a representative of FLAG and its members. This includes any postings on social media and any interviews, media coverage, whether it be digital or print.</w:t>
       </w:r>
     </w:p>
     <w:sectPr>
       <w:pgSz w:w="12240" w:h="15840"/>
-      <w:pgMar w:top="1440" w:right="1440" w:bottom="1440" w:left="1440" w:header="720" w:footer="720" w:gutter="0"/>
+      <w:pgMar w:top="720" w:right="720" w:bottom="720" w:left="720" w:header="720" w:footer="720" w:gutter="0"/>
       <w:cols w:space="720"/>
       <w:docGrid w:linePitch="360"/>
     </w:sectPr>
@@ -1761,6 +2769,29 @@
       <w:spacing w:val="5"/>
     </w:rPr>
   </w:style>
+  <w:style w:type="character" w:styleId="Hyperlink">
+    <w:name w:val="Hyperlink"/>
+    <w:basedOn w:val="DefaultParagraphFont"/>
+    <w:uiPriority w:val="99"/>
+    <w:unhideWhenUsed/>
+    <w:rsid w:val="00740C56"/>
+    <w:rPr>
+      <w:color w:val="467886" w:themeColor="hyperlink"/>
+      <w:u w:val="single"/>
+    </w:rPr>
+  </w:style>
+  <w:style w:type="character" w:styleId="UnresolvedMention">
+    <w:name w:val="Unresolved Mention"/>
+    <w:basedOn w:val="DefaultParagraphFont"/>
+    <w:uiPriority w:val="99"/>
+    <w:semiHidden/>
+    <w:unhideWhenUsed/>
+    <w:rsid w:val="00740C56"/>
+    <w:rPr>
+      <w:color w:val="605E5C"/>
+      <w:shd w:val="clear" w:color="auto" w:fill="E1DFDD"/>
+    </w:rPr>
+  </w:style>
 </w:styles>
 </file>
 

</xml_diff>